<commit_message>
test(stage1): isolate ambiguous DOCX journeys and preserve approved owner chain
</commit_message>
<xml_diff>
--- a/frontend/e2e/fixtures/candidate-governance.docx
+++ b/frontend/e2e/fixtures/candidate-governance.docx
@@ -3,16 +3,8 @@
 <w:document xmlns:wpc="http://schemas.microsoft.com/office/word/2010/wordprocessingCanvas" xmlns:mo="http://schemas.microsoft.com/office/mac/office/2008/main" xmlns:mc="http://schemas.openxmlformats.org/markup-compatibility/2006" xmlns:mv="urn:schemas-microsoft-com:mac:vml" xmlns:o="urn:schemas-microsoft-com:office:office" xmlns:r="http://schemas.openxmlformats.org/officeDocument/2006/relationships" xmlns:m="http://schemas.openxmlformats.org/officeDocument/2006/math" xmlns:v="urn:schemas-microsoft-com:vml" xmlns:wp14="http://schemas.microsoft.com/office/word/2010/wordprocessingDrawing" xmlns:wp="http://schemas.openxmlformats.org/drawingml/2006/wordprocessingDrawing" xmlns:w10="urn:schemas-microsoft-com:office:word" xmlns:w="http://schemas.openxmlformats.org/wordprocessingml/2006/main" xmlns:w14="http://schemas.microsoft.com/office/word/2010/wordml" xmlns:wpg="http://schemas.microsoft.com/office/word/2010/wordprocessingGroup" xmlns:wpi="http://schemas.microsoft.com/office/word/2010/wordprocessingInk" xmlns:wne="http://schemas.microsoft.com/office/word/2006/wordml" xmlns:wps="http://schemas.microsoft.com/office/word/2010/wordprocessingShape" mc:Ignorable="w14 wp14">
   <w:body>
     <w:p>
-      <w:pPr>
-        <w:pStyle w:val="Title"/>
-      </w:pPr>
       <w:r>
-        <w:t>Candidate governance recovery</w:t>
-      </w:r>
-    </w:p>
-    <w:p>
-      <w:r>
-        <w:t>R11_BROWSER_SOURCE_MARKER: an ambiguous operational note requiring explicit human confirmation before formal analysis.</w:t>
+        <w:t>R11_BROWSER_SOURCE_MARKER an ambiguous operational note requiring explicit human confirmation before formal analysis.</w:t>
       </w:r>
     </w:p>
     <w:sectPr>

</xml_diff>